<commit_message>
Passage des techno sous forme de tableau
</commit_message>
<xml_diff>
--- a/Documents/Rendu.docx
+++ b/Documents/Rendu.docx
@@ -37,64 +37,293 @@
         <w:t>1 Technologies utilisées :</w:t>
       </w:r>
     </w:p>
-    <w:p>
-      <w:pPr>
-        <w:pStyle w:val="Normal"/>
-        <w:bidi w:val="0"/>
-        <w:jc w:val="start"/>
-        <w:rPr/>
-      </w:pPr>
-      <w:r>
-        <w:rPr/>
-        <w:t>Front : React</w:t>
-      </w:r>
-    </w:p>
-    <w:p>
-      <w:pPr>
-        <w:pStyle w:val="Normal"/>
-        <w:bidi w:val="0"/>
-        <w:jc w:val="start"/>
-        <w:rPr/>
-      </w:pPr>
-      <w:r>
-        <w:rPr/>
-        <w:t>nginx</w:t>
-      </w:r>
-    </w:p>
-    <w:p>
-      <w:pPr>
-        <w:pStyle w:val="Normal"/>
-        <w:bidi w:val="0"/>
-        <w:jc w:val="start"/>
-        <w:rPr/>
-      </w:pPr>
-      <w:r>
-        <w:rPr/>
-        <w:t>serveur 1 : Deno Oak / JWT</w:t>
-      </w:r>
-    </w:p>
-    <w:p>
-      <w:pPr>
-        <w:pStyle w:val="Normal"/>
-        <w:bidi w:val="0"/>
-        <w:jc w:val="start"/>
-        <w:rPr/>
-      </w:pPr>
-      <w:r>
-        <w:rPr/>
-        <w:t>serveur 2 : Tomcat Spring</w:t>
-      </w:r>
-    </w:p>
-    <w:p>
-      <w:pPr>
-        <w:pStyle w:val="Normal"/>
-        <w:bidi w:val="0"/>
-        <w:jc w:val="start"/>
-        <w:rPr/>
-      </w:pPr>
-      <w:r>
-        <w:rPr/>
-        <w:t>Base de données : SQL SQLite, MongoDB</w:t>
+    <w:tbl>
+      <w:tblPr>
+        <w:tblW w:w="5000" w:type="pct"/>
+        <w:jc w:val="start"/>
+        <w:tblInd w:w="-5" w:type="dxa"/>
+        <w:tblLayout w:type="fixed"/>
+        <w:tblCellMar>
+          <w:top w:w="55" w:type="dxa"/>
+          <w:start w:w="55" w:type="dxa"/>
+          <w:bottom w:w="55" w:type="dxa"/>
+          <w:end w:w="55" w:type="dxa"/>
+        </w:tblCellMar>
+      </w:tblPr>
+      <w:tblGrid>
+        <w:gridCol w:w="4819"/>
+        <w:gridCol w:w="4819"/>
+      </w:tblGrid>
+      <w:tr>
+        <w:trPr/>
+        <w:tc>
+          <w:tcPr>
+            <w:tcW w:w="4819" w:type="dxa"/>
+            <w:tcBorders>
+              <w:top w:val="single" w:sz="4" w:space="0" w:color="000000"/>
+              <w:start w:val="single" w:sz="4" w:space="0" w:color="000000"/>
+              <w:bottom w:val="single" w:sz="4" w:space="0" w:color="000000"/>
+            </w:tcBorders>
+          </w:tcPr>
+          <w:p>
+            <w:pPr>
+              <w:pStyle w:val="Normal"/>
+              <w:bidi w:val="0"/>
+              <w:jc w:val="start"/>
+              <w:rPr/>
+            </w:pPr>
+            <w:r>
+              <w:rPr/>
+              <w:t>Front : React</w:t>
+            </w:r>
+          </w:p>
+        </w:tc>
+        <w:tc>
+          <w:tcPr>
+            <w:tcW w:w="4819" w:type="dxa"/>
+            <w:tcBorders>
+              <w:top w:val="single" w:sz="4" w:space="0" w:color="000000"/>
+              <w:start w:val="single" w:sz="4" w:space="0" w:color="000000"/>
+              <w:bottom w:val="single" w:sz="4" w:space="0" w:color="000000"/>
+              <w:end w:val="single" w:sz="4" w:space="0" w:color="000000"/>
+            </w:tcBorders>
+          </w:tcPr>
+          <w:p>
+            <w:pPr>
+              <w:pStyle w:val="Contenudetableau"/>
+              <w:rPr/>
+            </w:pPr>
+            <w:r>
+              <w:rPr/>
+            </w:r>
+          </w:p>
+        </w:tc>
+      </w:tr>
+      <w:tr>
+        <w:trPr/>
+        <w:tc>
+          <w:tcPr>
+            <w:tcW w:w="4819" w:type="dxa"/>
+            <w:tcBorders>
+              <w:start w:val="single" w:sz="4" w:space="0" w:color="000000"/>
+              <w:bottom w:val="single" w:sz="4" w:space="0" w:color="000000"/>
+            </w:tcBorders>
+          </w:tcPr>
+          <w:p>
+            <w:pPr>
+              <w:pStyle w:val="Normal"/>
+              <w:bidi w:val="0"/>
+              <w:jc w:val="start"/>
+              <w:rPr/>
+            </w:pPr>
+            <w:r>
+              <w:rPr/>
+              <w:t>nginx</w:t>
+            </w:r>
+          </w:p>
+        </w:tc>
+        <w:tc>
+          <w:tcPr>
+            <w:tcW w:w="4819" w:type="dxa"/>
+            <w:tcBorders>
+              <w:start w:val="single" w:sz="4" w:space="0" w:color="000000"/>
+              <w:bottom w:val="single" w:sz="4" w:space="0" w:color="000000"/>
+              <w:end w:val="single" w:sz="4" w:space="0" w:color="000000"/>
+            </w:tcBorders>
+          </w:tcPr>
+          <w:p>
+            <w:pPr>
+              <w:pStyle w:val="Contenudetableau"/>
+              <w:rPr/>
+            </w:pPr>
+            <w:r>
+              <w:rPr/>
+            </w:r>
+          </w:p>
+        </w:tc>
+      </w:tr>
+      <w:tr>
+        <w:trPr/>
+        <w:tc>
+          <w:tcPr>
+            <w:tcW w:w="4819" w:type="dxa"/>
+            <w:tcBorders>
+              <w:start w:val="single" w:sz="4" w:space="0" w:color="000000"/>
+              <w:bottom w:val="single" w:sz="4" w:space="0" w:color="000000"/>
+            </w:tcBorders>
+          </w:tcPr>
+          <w:p>
+            <w:pPr>
+              <w:pStyle w:val="Normal"/>
+              <w:bidi w:val="0"/>
+              <w:jc w:val="start"/>
+              <w:rPr/>
+            </w:pPr>
+            <w:r>
+              <w:rPr/>
+              <w:t>serveur 1 : Deno Oak / JWT</w:t>
+            </w:r>
+          </w:p>
+        </w:tc>
+        <w:tc>
+          <w:tcPr>
+            <w:tcW w:w="4819" w:type="dxa"/>
+            <w:tcBorders>
+              <w:start w:val="single" w:sz="4" w:space="0" w:color="000000"/>
+              <w:bottom w:val="single" w:sz="4" w:space="0" w:color="000000"/>
+              <w:end w:val="single" w:sz="4" w:space="0" w:color="000000"/>
+            </w:tcBorders>
+          </w:tcPr>
+          <w:p>
+            <w:pPr>
+              <w:pStyle w:val="Contenudetableau"/>
+              <w:rPr/>
+            </w:pPr>
+            <w:r>
+              <w:rPr/>
+            </w:r>
+          </w:p>
+        </w:tc>
+      </w:tr>
+      <w:tr>
+        <w:trPr/>
+        <w:tc>
+          <w:tcPr>
+            <w:tcW w:w="4819" w:type="dxa"/>
+            <w:tcBorders>
+              <w:start w:val="single" w:sz="4" w:space="0" w:color="000000"/>
+              <w:bottom w:val="single" w:sz="4" w:space="0" w:color="000000"/>
+            </w:tcBorders>
+          </w:tcPr>
+          <w:p>
+            <w:pPr>
+              <w:pStyle w:val="Normal"/>
+              <w:bidi w:val="0"/>
+              <w:jc w:val="start"/>
+              <w:rPr/>
+            </w:pPr>
+            <w:r>
+              <w:rPr/>
+              <w:t>serveur 2 : Tomcat Spring</w:t>
+            </w:r>
+          </w:p>
+        </w:tc>
+        <w:tc>
+          <w:tcPr>
+            <w:tcW w:w="4819" w:type="dxa"/>
+            <w:tcBorders>
+              <w:start w:val="single" w:sz="4" w:space="0" w:color="000000"/>
+              <w:bottom w:val="single" w:sz="4" w:space="0" w:color="000000"/>
+              <w:end w:val="single" w:sz="4" w:space="0" w:color="000000"/>
+            </w:tcBorders>
+          </w:tcPr>
+          <w:p>
+            <w:pPr>
+              <w:pStyle w:val="Contenudetableau"/>
+              <w:rPr/>
+            </w:pPr>
+            <w:r>
+              <w:rPr/>
+            </w:r>
+          </w:p>
+        </w:tc>
+      </w:tr>
+      <w:tr>
+        <w:trPr/>
+        <w:tc>
+          <w:tcPr>
+            <w:tcW w:w="4819" w:type="dxa"/>
+            <w:tcBorders>
+              <w:start w:val="single" w:sz="4" w:space="0" w:color="000000"/>
+              <w:bottom w:val="single" w:sz="4" w:space="0" w:color="000000"/>
+            </w:tcBorders>
+          </w:tcPr>
+          <w:p>
+            <w:pPr>
+              <w:pStyle w:val="Normal"/>
+              <w:bidi w:val="0"/>
+              <w:jc w:val="start"/>
+              <w:rPr/>
+            </w:pPr>
+            <w:r>
+              <w:rPr/>
+              <w:t>SQL SQLite</w:t>
+            </w:r>
+          </w:p>
+        </w:tc>
+        <w:tc>
+          <w:tcPr>
+            <w:tcW w:w="4819" w:type="dxa"/>
+            <w:tcBorders>
+              <w:start w:val="single" w:sz="4" w:space="0" w:color="000000"/>
+              <w:bottom w:val="single" w:sz="4" w:space="0" w:color="000000"/>
+              <w:end w:val="single" w:sz="4" w:space="0" w:color="000000"/>
+            </w:tcBorders>
+          </w:tcPr>
+          <w:p>
+            <w:pPr>
+              <w:pStyle w:val="Contenudetableau"/>
+              <w:rPr/>
+            </w:pPr>
+            <w:r>
+              <w:rPr/>
+            </w:r>
+          </w:p>
+        </w:tc>
+      </w:tr>
+      <w:tr>
+        <w:trPr/>
+        <w:tc>
+          <w:tcPr>
+            <w:tcW w:w="4819" w:type="dxa"/>
+            <w:tcBorders>
+              <w:start w:val="single" w:sz="4" w:space="0" w:color="000000"/>
+              <w:bottom w:val="single" w:sz="4" w:space="0" w:color="000000"/>
+            </w:tcBorders>
+          </w:tcPr>
+          <w:p>
+            <w:pPr>
+              <w:pStyle w:val="Normal"/>
+              <w:bidi w:val="0"/>
+              <w:jc w:val="start"/>
+              <w:rPr/>
+            </w:pPr>
+            <w:r>
+              <w:rPr/>
+              <w:t>MongoDB</w:t>
+            </w:r>
+          </w:p>
+        </w:tc>
+        <w:tc>
+          <w:tcPr>
+            <w:tcW w:w="4819" w:type="dxa"/>
+            <w:tcBorders>
+              <w:start w:val="single" w:sz="4" w:space="0" w:color="000000"/>
+              <w:bottom w:val="single" w:sz="4" w:space="0" w:color="000000"/>
+              <w:end w:val="single" w:sz="4" w:space="0" w:color="000000"/>
+            </w:tcBorders>
+          </w:tcPr>
+          <w:p>
+            <w:pPr>
+              <w:pStyle w:val="Contenudetableau"/>
+              <w:rPr/>
+            </w:pPr>
+            <w:r>
+              <w:rPr/>
+            </w:r>
+          </w:p>
+        </w:tc>
+      </w:tr>
+    </w:tbl>
+    <w:p>
+      <w:pPr>
+        <w:pStyle w:val="Normal"/>
+        <w:bidi w:val="0"/>
+        <w:jc w:val="start"/>
+        <w:rPr/>
+      </w:pPr>
+      <w:r>
+        <w:rPr/>
       </w:r>
     </w:p>
     <w:p>
@@ -583,6 +812,7 @@
       <w:pgNumType w:fmt="decimal"/>
       <w:formProt w:val="false"/>
       <w:textDirection w:val="lrTb"/>
+      <w:docGrid w:type="default" w:linePitch="100" w:charSpace="0"/>
     </w:sectPr>
   </w:body>
 </w:document>
@@ -602,7 +832,6 @@
     </w:rPrDefault>
     <w:pPrDefault>
       <w:pPr>
-        <w:widowControl/>
         <w:suppressAutoHyphens w:val="true"/>
       </w:pPr>
     </w:pPrDefault>
@@ -612,7 +841,10 @@
     <w:qFormat/>
     <w:pPr>
       <w:widowControl/>
+      <w:suppressAutoHyphens w:val="true"/>
       <w:bidi w:val="0"/>
+      <w:spacing w:before="0" w:after="0"/>
+      <w:jc w:val="start"/>
     </w:pPr>
     <w:rPr>
       <w:rFonts w:ascii="Liberation Serif" w:hAnsi="Liberation Serif" w:eastAsia="NSimSun" w:cs="Lucida Sans"/>
@@ -680,6 +912,31 @@
     <w:rPr>
       <w:rFonts w:cs="Lucida Sans"/>
     </w:rPr>
+  </w:style>
+  <w:style w:type="paragraph" w:styleId="Titreuser">
+    <w:name w:val="Titre (user)"/>
+    <w:basedOn w:val="Normal"/>
+    <w:next w:val="BodyText"/>
+    <w:qFormat/>
+    <w:pPr>
+      <w:keepNext w:val="true"/>
+      <w:spacing w:before="240" w:after="120"/>
+    </w:pPr>
+    <w:rPr>
+      <w:rFonts w:ascii="Liberation Sans" w:hAnsi="Liberation Sans" w:eastAsia="Microsoft YaHei" w:cs="Lucida Sans"/>
+      <w:sz w:val="28"/>
+      <w:szCs w:val="28"/>
+    </w:rPr>
+  </w:style>
+  <w:style w:type="paragraph" w:styleId="Contenudetableau">
+    <w:name w:val="Contenu de tableau"/>
+    <w:basedOn w:val="Normal"/>
+    <w:qFormat/>
+    <w:pPr>
+      <w:widowControl w:val="false"/>
+      <w:suppressLineNumbers/>
+    </w:pPr>
+    <w:rPr/>
   </w:style>
 </w:styles>
 </file>

</xml_diff>

<commit_message>
Update Rendu pour fonctionnalités
</commit_message>
<xml_diff>
--- a/Documents/Rendu.docx
+++ b/Documents/Rendu.docx
@@ -51,14 +51,14 @@
         </w:tblCellMar>
       </w:tblPr>
       <w:tblGrid>
-        <w:gridCol w:w="4819"/>
-        <w:gridCol w:w="4819"/>
+        <w:gridCol w:w="4818"/>
+        <w:gridCol w:w="4820"/>
       </w:tblGrid>
       <w:tr>
         <w:trPr/>
         <w:tc>
           <w:tcPr>
-            <w:tcW w:w="4819" w:type="dxa"/>
+            <w:tcW w:w="4818" w:type="dxa"/>
             <w:tcBorders>
               <w:top w:val="single" w:sz="4" w:space="0" w:color="000000"/>
               <w:start w:val="single" w:sz="4" w:space="0" w:color="000000"/>
@@ -80,7 +80,7 @@
         </w:tc>
         <w:tc>
           <w:tcPr>
-            <w:tcW w:w="4819" w:type="dxa"/>
+            <w:tcW w:w="4820" w:type="dxa"/>
             <w:tcBorders>
               <w:top w:val="single" w:sz="4" w:space="0" w:color="000000"/>
               <w:start w:val="single" w:sz="4" w:space="0" w:color="000000"/>
@@ -90,7 +90,7 @@
           </w:tcPr>
           <w:p>
             <w:pPr>
-              <w:pStyle w:val="Contenudetableau"/>
+              <w:pStyle w:val="Contenudetableauuser"/>
               <w:rPr/>
             </w:pPr>
             <w:r>
@@ -103,7 +103,7 @@
         <w:trPr/>
         <w:tc>
           <w:tcPr>
-            <w:tcW w:w="4819" w:type="dxa"/>
+            <w:tcW w:w="4818" w:type="dxa"/>
             <w:tcBorders>
               <w:start w:val="single" w:sz="4" w:space="0" w:color="000000"/>
               <w:bottom w:val="single" w:sz="4" w:space="0" w:color="000000"/>
@@ -124,7 +124,7 @@
         </w:tc>
         <w:tc>
           <w:tcPr>
-            <w:tcW w:w="4819" w:type="dxa"/>
+            <w:tcW w:w="4820" w:type="dxa"/>
             <w:tcBorders>
               <w:start w:val="single" w:sz="4" w:space="0" w:color="000000"/>
               <w:bottom w:val="single" w:sz="4" w:space="0" w:color="000000"/>
@@ -133,7 +133,7 @@
           </w:tcPr>
           <w:p>
             <w:pPr>
-              <w:pStyle w:val="Contenudetableau"/>
+              <w:pStyle w:val="Contenudetableauuser"/>
               <w:rPr/>
             </w:pPr>
             <w:r>
@@ -146,7 +146,7 @@
         <w:trPr/>
         <w:tc>
           <w:tcPr>
-            <w:tcW w:w="4819" w:type="dxa"/>
+            <w:tcW w:w="4818" w:type="dxa"/>
             <w:tcBorders>
               <w:start w:val="single" w:sz="4" w:space="0" w:color="000000"/>
               <w:bottom w:val="single" w:sz="4" w:space="0" w:color="000000"/>
@@ -167,7 +167,7 @@
         </w:tc>
         <w:tc>
           <w:tcPr>
-            <w:tcW w:w="4819" w:type="dxa"/>
+            <w:tcW w:w="4820" w:type="dxa"/>
             <w:tcBorders>
               <w:start w:val="single" w:sz="4" w:space="0" w:color="000000"/>
               <w:bottom w:val="single" w:sz="4" w:space="0" w:color="000000"/>
@@ -176,7 +176,7 @@
           </w:tcPr>
           <w:p>
             <w:pPr>
-              <w:pStyle w:val="Contenudetableau"/>
+              <w:pStyle w:val="Contenudetableauuser"/>
               <w:rPr/>
             </w:pPr>
             <w:r>
@@ -189,7 +189,7 @@
         <w:trPr/>
         <w:tc>
           <w:tcPr>
-            <w:tcW w:w="4819" w:type="dxa"/>
+            <w:tcW w:w="4818" w:type="dxa"/>
             <w:tcBorders>
               <w:start w:val="single" w:sz="4" w:space="0" w:color="000000"/>
               <w:bottom w:val="single" w:sz="4" w:space="0" w:color="000000"/>
@@ -210,7 +210,7 @@
         </w:tc>
         <w:tc>
           <w:tcPr>
-            <w:tcW w:w="4819" w:type="dxa"/>
+            <w:tcW w:w="4820" w:type="dxa"/>
             <w:tcBorders>
               <w:start w:val="single" w:sz="4" w:space="0" w:color="000000"/>
               <w:bottom w:val="single" w:sz="4" w:space="0" w:color="000000"/>
@@ -219,7 +219,7 @@
           </w:tcPr>
           <w:p>
             <w:pPr>
-              <w:pStyle w:val="Contenudetableau"/>
+              <w:pStyle w:val="Contenudetableauuser"/>
               <w:rPr/>
             </w:pPr>
             <w:r>
@@ -232,7 +232,7 @@
         <w:trPr/>
         <w:tc>
           <w:tcPr>
-            <w:tcW w:w="4819" w:type="dxa"/>
+            <w:tcW w:w="4818" w:type="dxa"/>
             <w:tcBorders>
               <w:start w:val="single" w:sz="4" w:space="0" w:color="000000"/>
               <w:bottom w:val="single" w:sz="4" w:space="0" w:color="000000"/>
@@ -253,7 +253,7 @@
         </w:tc>
         <w:tc>
           <w:tcPr>
-            <w:tcW w:w="4819" w:type="dxa"/>
+            <w:tcW w:w="4820" w:type="dxa"/>
             <w:tcBorders>
               <w:start w:val="single" w:sz="4" w:space="0" w:color="000000"/>
               <w:bottom w:val="single" w:sz="4" w:space="0" w:color="000000"/>
@@ -262,7 +262,7 @@
           </w:tcPr>
           <w:p>
             <w:pPr>
-              <w:pStyle w:val="Contenudetableau"/>
+              <w:pStyle w:val="Contenudetableauuser"/>
               <w:rPr/>
             </w:pPr>
             <w:r>
@@ -275,7 +275,7 @@
         <w:trPr/>
         <w:tc>
           <w:tcPr>
-            <w:tcW w:w="4819" w:type="dxa"/>
+            <w:tcW w:w="4818" w:type="dxa"/>
             <w:tcBorders>
               <w:start w:val="single" w:sz="4" w:space="0" w:color="000000"/>
               <w:bottom w:val="single" w:sz="4" w:space="0" w:color="000000"/>
@@ -296,7 +296,7 @@
         </w:tc>
         <w:tc>
           <w:tcPr>
-            <w:tcW w:w="4819" w:type="dxa"/>
+            <w:tcW w:w="4820" w:type="dxa"/>
             <w:tcBorders>
               <w:start w:val="single" w:sz="4" w:space="0" w:color="000000"/>
               <w:bottom w:val="single" w:sz="4" w:space="0" w:color="000000"/>
@@ -305,7 +305,7 @@
           </w:tcPr>
           <w:p>
             <w:pPr>
-              <w:pStyle w:val="Contenudetableau"/>
+              <w:pStyle w:val="Contenudetableauuser"/>
               <w:rPr/>
             </w:pPr>
             <w:r>
@@ -375,59 +375,79 @@
       <w:r>
         <w:rPr/>
         <w:tab/>
-        <w:t>— Création de compte utilisateur</w:t>
-      </w:r>
-    </w:p>
-    <w:p>
-      <w:pPr>
-        <w:pStyle w:val="Normal"/>
-        <w:bidi w:val="0"/>
-        <w:jc w:val="start"/>
-        <w:rPr/>
-      </w:pPr>
-      <w:r>
-        <w:rPr/>
-        <w:tab/>
-        <w:t>— Authentification</w:t>
-      </w:r>
-    </w:p>
-    <w:p>
-      <w:pPr>
-        <w:pStyle w:val="Normal"/>
-        <w:bidi w:val="0"/>
-        <w:jc w:val="start"/>
-        <w:rPr/>
-      </w:pPr>
-      <w:r>
-        <w:rPr/>
-        <w:tab/>
-        <w:t>— Consultation des tableaux auxquels l’utilisateur participe</w:t>
-      </w:r>
-    </w:p>
-    <w:p>
-      <w:pPr>
-        <w:pStyle w:val="Normal"/>
-        <w:bidi w:val="0"/>
-        <w:jc w:val="start"/>
-        <w:rPr/>
-      </w:pPr>
-      <w:r>
-        <w:rPr/>
-        <w:tab/>
-        <w:t>— Création d’un tableau</w:t>
-      </w:r>
-    </w:p>
-    <w:p>
-      <w:pPr>
-        <w:pStyle w:val="Normal"/>
-        <w:bidi w:val="0"/>
-        <w:jc w:val="start"/>
-        <w:rPr/>
-      </w:pPr>
-      <w:r>
-        <w:rPr/>
-        <w:tab/>
-        <w:t>— Invitation d’utilisateurs à un tableau</w:t>
+        <w:t xml:space="preserve">— Création de compte utilisateur </w:t>
+      </w:r>
+      <w:r>
+        <w:rPr/>
+        <w:t>OK</w:t>
+      </w:r>
+    </w:p>
+    <w:p>
+      <w:pPr>
+        <w:pStyle w:val="Normal"/>
+        <w:bidi w:val="0"/>
+        <w:jc w:val="start"/>
+        <w:rPr/>
+      </w:pPr>
+      <w:r>
+        <w:rPr/>
+        <w:tab/>
+        <w:t xml:space="preserve">— Authentification </w:t>
+      </w:r>
+      <w:r>
+        <w:rPr/>
+        <w:t>OK</w:t>
+      </w:r>
+    </w:p>
+    <w:p>
+      <w:pPr>
+        <w:pStyle w:val="Normal"/>
+        <w:bidi w:val="0"/>
+        <w:jc w:val="start"/>
+        <w:rPr/>
+      </w:pPr>
+      <w:r>
+        <w:rPr/>
+        <w:tab/>
+        <w:t xml:space="preserve">— Consultation des tableaux auxquels l’utilisateur participe </w:t>
+      </w:r>
+      <w:r>
+        <w:rPr/>
+        <w:t>KO</w:t>
+      </w:r>
+    </w:p>
+    <w:p>
+      <w:pPr>
+        <w:pStyle w:val="Normal"/>
+        <w:bidi w:val="0"/>
+        <w:jc w:val="start"/>
+        <w:rPr/>
+      </w:pPr>
+      <w:r>
+        <w:rPr/>
+        <w:tab/>
+        <w:t xml:space="preserve">— Création d’un tableau </w:t>
+      </w:r>
+      <w:r>
+        <w:rPr/>
+        <w:t>OK</w:t>
+      </w:r>
+    </w:p>
+    <w:p>
+      <w:pPr>
+        <w:pStyle w:val="Normal"/>
+        <w:bidi w:val="0"/>
+        <w:jc w:val="start"/>
+        <w:rPr/>
+      </w:pPr>
+      <w:r>
+        <w:rPr/>
+        <w:tab/>
+        <w:t xml:space="preserve">— Invitation d’utilisateurs à un tableau </w:t>
+      </w:r>
+      <w:r>
+        <w:rPr/>
+        <w:t>KO</w:t>
       </w:r>
     </w:p>
     <w:p>
@@ -454,105 +474,137 @@
         <w:rPr/>
         <w:tab/>
         <w:tab/>
-        <w:t>— Création, modification et suppression de tableaux 1</w:t>
-      </w:r>
-    </w:p>
-    <w:p>
-      <w:pPr>
-        <w:pStyle w:val="Normal"/>
-        <w:bidi w:val="0"/>
-        <w:jc w:val="start"/>
-        <w:rPr/>
-      </w:pPr>
-      <w:r>
-        <w:rPr/>
-        <w:tab/>
-        <w:tab/>
-        <w:t>— Gestion des membres d’un tableau</w:t>
-      </w:r>
-    </w:p>
-    <w:p>
-      <w:pPr>
-        <w:pStyle w:val="Normal"/>
-        <w:bidi w:val="0"/>
-        <w:jc w:val="start"/>
-        <w:rPr/>
-      </w:pPr>
-      <w:r>
-        <w:rPr/>
-        <w:tab/>
-        <w:tab/>
-        <w:t>— Création et suppression de colonnes</w:t>
-      </w:r>
-    </w:p>
-    <w:p>
-      <w:pPr>
-        <w:pStyle w:val="Normal"/>
-        <w:bidi w:val="0"/>
-        <w:jc w:val="start"/>
-        <w:rPr/>
-      </w:pPr>
-      <w:r>
-        <w:rPr/>
-        <w:tab/>
-        <w:tab/>
-        <w:t>— Gestion des tâches</w:t>
-      </w:r>
-    </w:p>
-    <w:p>
-      <w:pPr>
-        <w:pStyle w:val="Normal"/>
-        <w:bidi w:val="0"/>
-        <w:jc w:val="start"/>
-        <w:rPr/>
-      </w:pPr>
-      <w:r>
-        <w:rPr/>
-        <w:tab/>
-        <w:tab/>
-        <w:t>— Création, modification et suppression de tâches</w:t>
-      </w:r>
-    </w:p>
-    <w:p>
-      <w:pPr>
-        <w:pStyle w:val="Normal"/>
-        <w:bidi w:val="0"/>
-        <w:jc w:val="start"/>
-        <w:rPr/>
-      </w:pPr>
-      <w:r>
-        <w:rPr/>
-        <w:tab/>
-        <w:tab/>
-        <w:t>— Attribution d’une tâche à un utilisateur</w:t>
-      </w:r>
-    </w:p>
-    <w:p>
-      <w:pPr>
-        <w:pStyle w:val="Normal"/>
-        <w:bidi w:val="0"/>
-        <w:jc w:val="start"/>
-        <w:rPr/>
-      </w:pPr>
-      <w:r>
-        <w:rPr/>
-        <w:tab/>
-        <w:tab/>
-        <w:t>— Ajout d’une date limite et d’une priorité</w:t>
-      </w:r>
-    </w:p>
-    <w:p>
-      <w:pPr>
-        <w:pStyle w:val="Normal"/>
-        <w:bidi w:val="0"/>
-        <w:jc w:val="start"/>
-        <w:rPr/>
-      </w:pPr>
-      <w:r>
-        <w:rPr/>
-        <w:tab/>
-        <w:tab/>
-        <w:t>— Ajout de commentaires</w:t>
+        <w:t xml:space="preserve">— Création, modification et suppression de tableaux </w:t>
+      </w:r>
+      <w:r>
+        <w:rPr/>
+        <w:t>OK</w:t>
+      </w:r>
+    </w:p>
+    <w:p>
+      <w:pPr>
+        <w:pStyle w:val="Normal"/>
+        <w:bidi w:val="0"/>
+        <w:jc w:val="start"/>
+        <w:rPr/>
+      </w:pPr>
+      <w:r>
+        <w:rPr/>
+        <w:tab/>
+        <w:tab/>
+        <w:t xml:space="preserve">— Gestion des membres d’un tableau </w:t>
+      </w:r>
+      <w:r>
+        <w:rPr/>
+        <w:t>KO</w:t>
+      </w:r>
+    </w:p>
+    <w:p>
+      <w:pPr>
+        <w:pStyle w:val="Normal"/>
+        <w:bidi w:val="0"/>
+        <w:jc w:val="start"/>
+        <w:rPr/>
+      </w:pPr>
+      <w:r>
+        <w:rPr/>
+        <w:tab/>
+        <w:tab/>
+        <w:t xml:space="preserve">— Création et suppression de colonnes </w:t>
+      </w:r>
+      <w:r>
+        <w:rPr/>
+        <w:t>OK (côté back)</w:t>
+      </w:r>
+    </w:p>
+    <w:p>
+      <w:pPr>
+        <w:pStyle w:val="Normal"/>
+        <w:bidi w:val="0"/>
+        <w:jc w:val="start"/>
+        <w:rPr/>
+      </w:pPr>
+      <w:r>
+        <w:rPr/>
+        <w:tab/>
+        <w:tab/>
+        <w:t xml:space="preserve">— Gestion des tâches </w:t>
+      </w:r>
+      <w:r>
+        <w:rPr/>
+        <w:t>OK</w:t>
+      </w:r>
+    </w:p>
+    <w:p>
+      <w:pPr>
+        <w:pStyle w:val="Normal"/>
+        <w:bidi w:val="0"/>
+        <w:jc w:val="start"/>
+        <w:rPr/>
+      </w:pPr>
+      <w:r>
+        <w:rPr/>
+        <w:tab/>
+        <w:tab/>
+        <w:t xml:space="preserve">— Création, modification et suppression de tâches </w:t>
+      </w:r>
+      <w:r>
+        <w:rPr/>
+        <w:t>OK</w:t>
+      </w:r>
+    </w:p>
+    <w:p>
+      <w:pPr>
+        <w:pStyle w:val="Normal"/>
+        <w:bidi w:val="0"/>
+        <w:jc w:val="start"/>
+        <w:rPr/>
+      </w:pPr>
+      <w:r>
+        <w:rPr/>
+        <w:tab/>
+        <w:tab/>
+        <w:t xml:space="preserve">— Attribution d’une tâche à un utilisateur </w:t>
+      </w:r>
+      <w:r>
+        <w:rPr/>
+        <w:t>KO</w:t>
+      </w:r>
+    </w:p>
+    <w:p>
+      <w:pPr>
+        <w:pStyle w:val="Normal"/>
+        <w:bidi w:val="0"/>
+        <w:jc w:val="start"/>
+        <w:rPr/>
+      </w:pPr>
+      <w:r>
+        <w:rPr/>
+        <w:tab/>
+        <w:tab/>
+        <w:t xml:space="preserve">— Ajout d’une date limite et d’une priorité </w:t>
+      </w:r>
+      <w:r>
+        <w:rPr/>
+        <w:t xml:space="preserve">OK </w:t>
+      </w:r>
+    </w:p>
+    <w:p>
+      <w:pPr>
+        <w:pStyle w:val="Normal"/>
+        <w:bidi w:val="0"/>
+        <w:jc w:val="start"/>
+        <w:rPr/>
+      </w:pPr>
+      <w:r>
+        <w:rPr/>
+        <w:tab/>
+        <w:tab/>
+        <w:t xml:space="preserve">— Ajout de commentaires </w:t>
+      </w:r>
+      <w:r>
+        <w:rPr/>
+        <w:t>OK</w:t>
       </w:r>
     </w:p>
     <w:p>
@@ -581,7 +633,11 @@
       <w:r>
         <w:rPr/>
         <w:tab/>
-        <w:t>— Gestion des comptes utilisateurs</w:t>
+        <w:t xml:space="preserve">— Gestion des comptes utilisateurs </w:t>
+      </w:r>
+      <w:r>
+        <w:rPr/>
+        <w:t>OK</w:t>
       </w:r>
     </w:p>
     <w:p>
@@ -608,35 +664,47 @@
         <w:rPr/>
         <w:tab/>
         <w:tab/>
-        <w:t>— nombre de tableaux</w:t>
-      </w:r>
-    </w:p>
-    <w:p>
-      <w:pPr>
-        <w:pStyle w:val="Normal"/>
-        <w:bidi w:val="0"/>
-        <w:jc w:val="start"/>
-        <w:rPr/>
-      </w:pPr>
-      <w:r>
-        <w:rPr/>
-        <w:tab/>
-        <w:tab/>
-        <w:t>— nombre de tâches</w:t>
-      </w:r>
-    </w:p>
-    <w:p>
-      <w:pPr>
-        <w:pStyle w:val="Normal"/>
-        <w:bidi w:val="0"/>
-        <w:jc w:val="start"/>
-        <w:rPr/>
-      </w:pPr>
-      <w:r>
-        <w:rPr/>
-        <w:tab/>
-        <w:tab/>
-        <w:t>— activité des utilisateurs</w:t>
+        <w:t xml:space="preserve">— nombre de tableaux </w:t>
+      </w:r>
+      <w:r>
+        <w:rPr/>
+        <w:t xml:space="preserve">OK </w:t>
+      </w:r>
+    </w:p>
+    <w:p>
+      <w:pPr>
+        <w:pStyle w:val="Normal"/>
+        <w:bidi w:val="0"/>
+        <w:jc w:val="start"/>
+        <w:rPr/>
+      </w:pPr>
+      <w:r>
+        <w:rPr/>
+        <w:tab/>
+        <w:tab/>
+        <w:t xml:space="preserve">— nombre de tâches </w:t>
+      </w:r>
+      <w:r>
+        <w:rPr/>
+        <w:t>OK</w:t>
+      </w:r>
+    </w:p>
+    <w:p>
+      <w:pPr>
+        <w:pStyle w:val="Normal"/>
+        <w:bidi w:val="0"/>
+        <w:jc w:val="start"/>
+        <w:rPr/>
+      </w:pPr>
+      <w:r>
+        <w:rPr/>
+        <w:tab/>
+        <w:tab/>
+        <w:t xml:space="preserve">— activité des utilisateurs </w:t>
+      </w:r>
+      <w:r>
+        <w:rPr/>
+        <w:t>KO</w:t>
       </w:r>
     </w:p>
     <w:p>
@@ -679,35 +747,47 @@
         <w:rPr/>
         <w:tab/>
         <w:tab/>
-        <w:t>— Réorganisation des colonnes</w:t>
-      </w:r>
-    </w:p>
-    <w:p>
-      <w:pPr>
-        <w:pStyle w:val="Normal"/>
-        <w:bidi w:val="0"/>
-        <w:jc w:val="start"/>
-        <w:rPr/>
-      </w:pPr>
-      <w:r>
-        <w:rPr/>
-        <w:tab/>
-        <w:tab/>
-        <w:t>— Déplacement de tâches entre colonnes (drag &amp; drop)</w:t>
-      </w:r>
-    </w:p>
-    <w:p>
-      <w:pPr>
-        <w:pStyle w:val="Normal"/>
-        <w:bidi w:val="0"/>
-        <w:jc w:val="start"/>
-        <w:rPr/>
-      </w:pPr>
-      <w:r>
-        <w:rPr/>
-        <w:tab/>
-        <w:tab/>
-        <w:t>— Ajout de pièces jointes</w:t>
+        <w:t xml:space="preserve">— Réorganisation des colonnes </w:t>
+      </w:r>
+      <w:r>
+        <w:rPr/>
+        <w:t>KO</w:t>
+      </w:r>
+    </w:p>
+    <w:p>
+      <w:pPr>
+        <w:pStyle w:val="Normal"/>
+        <w:bidi w:val="0"/>
+        <w:jc w:val="start"/>
+        <w:rPr/>
+      </w:pPr>
+      <w:r>
+        <w:rPr/>
+        <w:tab/>
+        <w:tab/>
+        <w:t xml:space="preserve">— Déplacement de tâches entre colonnes (drag &amp; drop) </w:t>
+      </w:r>
+      <w:r>
+        <w:rPr/>
+        <w:t>OK</w:t>
+      </w:r>
+    </w:p>
+    <w:p>
+      <w:pPr>
+        <w:pStyle w:val="Normal"/>
+        <w:bidi w:val="0"/>
+        <w:jc w:val="start"/>
+        <w:rPr/>
+      </w:pPr>
+      <w:r>
+        <w:rPr/>
+        <w:tab/>
+        <w:tab/>
+        <w:t xml:space="preserve">— Ajout de pièces jointes </w:t>
+      </w:r>
+      <w:r>
+        <w:rPr/>
+        <w:t>KO</w:t>
       </w:r>
     </w:p>
     <w:p>
@@ -734,21 +814,29 @@
         <w:rPr/>
         <w:tab/>
         <w:tab/>
-        <w:t>— Mise à jour instantanée des tableaux avec WebSockets (par exemple lorsqu’une tâche est déplacée)</w:t>
-      </w:r>
-    </w:p>
-    <w:p>
-      <w:pPr>
-        <w:pStyle w:val="Normal"/>
-        <w:bidi w:val="0"/>
-        <w:jc w:val="start"/>
-        <w:rPr/>
-      </w:pPr>
-      <w:r>
-        <w:rPr/>
-        <w:tab/>
-        <w:tab/>
-        <w:t>— Notification lorsqu’une tâche est assignée ou commentée</w:t>
+        <w:t xml:space="preserve">— Mise à jour instantanée des tableaux avec WebSockets (par exemple lorsqu’une tâche est déplacée) </w:t>
+      </w:r>
+      <w:r>
+        <w:rPr/>
+        <w:t>KO</w:t>
+      </w:r>
+    </w:p>
+    <w:p>
+      <w:pPr>
+        <w:pStyle w:val="Normal"/>
+        <w:bidi w:val="0"/>
+        <w:jc w:val="start"/>
+        <w:rPr/>
+      </w:pPr>
+      <w:r>
+        <w:rPr/>
+        <w:tab/>
+        <w:tab/>
+        <w:t xml:space="preserve">— Notification lorsqu’une tâche est assignée ou commentée </w:t>
+      </w:r>
+      <w:r>
+        <w:rPr/>
+        <w:t>KO</w:t>
       </w:r>
     </w:p>
     <w:p>
@@ -775,7 +863,11 @@
         <w:rPr/>
         <w:tab/>
         <w:tab/>
-        <w:t>— Journal des actions (création, déplacement et modification des tâches)</w:t>
+        <w:t xml:space="preserve">— Journal des actions (création, déplacement et modification des tâches) </w:t>
+      </w:r>
+      <w:r>
+        <w:rPr/>
+        <w:t>OK</w:t>
       </w:r>
     </w:p>
     <w:p>
@@ -803,6 +895,10 @@
         <w:tab/>
         <w:tab/>
         <w:t xml:space="preserve">— Recherche de tâches par mot-clé, utilisateur ou priorité </w:t>
+      </w:r>
+      <w:r>
+        <w:rPr/>
+        <w:t>OK (sauf pour taches)</w:t>
       </w:r>
     </w:p>
     <w:sectPr>
@@ -928,8 +1024,8 @@
       <w:szCs w:val="28"/>
     </w:rPr>
   </w:style>
-  <w:style w:type="paragraph" w:styleId="Contenudetableau">
-    <w:name w:val="Contenu de tableau"/>
+  <w:style w:type="paragraph" w:styleId="Contenudetableauuser">
+    <w:name w:val="Contenu de tableau (user)"/>
     <w:basedOn w:val="Normal"/>
     <w:qFormat/>
     <w:pPr>

</xml_diff>

<commit_message>
Update Rendu pour techno
</commit_message>
<xml_diff>
--- a/Documents/Rendu.docx
+++ b/Documents/Rendu.docx
@@ -74,7 +74,7 @@
             </w:pPr>
             <w:r>
               <w:rPr/>
-              <w:t>Front : React</w:t>
+              <w:t xml:space="preserve">Front : </w:t>
             </w:r>
           </w:p>
         </w:tc>
@@ -90,11 +90,14 @@
           </w:tcPr>
           <w:p>
             <w:pPr>
-              <w:pStyle w:val="Contenudetableauuser"/>
-              <w:rPr/>
-            </w:pPr>
-            <w:r>
-              <w:rPr/>
+              <w:pStyle w:val="Normal"/>
+              <w:bidi w:val="0"/>
+              <w:jc w:val="start"/>
+              <w:rPr/>
+            </w:pPr>
+            <w:r>
+              <w:rPr/>
+              <w:t>React</w:t>
             </w:r>
           </w:p>
         </w:tc>
@@ -118,26 +121,29 @@
             </w:pPr>
             <w:r>
               <w:rPr/>
+              <w:t>Déploiement</w:t>
+            </w:r>
+          </w:p>
+        </w:tc>
+        <w:tc>
+          <w:tcPr>
+            <w:tcW w:w="4820" w:type="dxa"/>
+            <w:tcBorders>
+              <w:start w:val="single" w:sz="4" w:space="0" w:color="000000"/>
+              <w:bottom w:val="single" w:sz="4" w:space="0" w:color="000000"/>
+              <w:end w:val="single" w:sz="4" w:space="0" w:color="000000"/>
+            </w:tcBorders>
+          </w:tcPr>
+          <w:p>
+            <w:pPr>
+              <w:pStyle w:val="Normal"/>
+              <w:bidi w:val="0"/>
+              <w:jc w:val="start"/>
+              <w:rPr/>
+            </w:pPr>
+            <w:r>
+              <w:rPr/>
               <w:t>nginx</w:t>
-            </w:r>
-          </w:p>
-        </w:tc>
-        <w:tc>
-          <w:tcPr>
-            <w:tcW w:w="4820" w:type="dxa"/>
-            <w:tcBorders>
-              <w:start w:val="single" w:sz="4" w:space="0" w:color="000000"/>
-              <w:bottom w:val="single" w:sz="4" w:space="0" w:color="000000"/>
-              <w:end w:val="single" w:sz="4" w:space="0" w:color="000000"/>
-            </w:tcBorders>
-          </w:tcPr>
-          <w:p>
-            <w:pPr>
-              <w:pStyle w:val="Contenudetableauuser"/>
-              <w:rPr/>
-            </w:pPr>
-            <w:r>
-              <w:rPr/>
             </w:r>
           </w:p>
         </w:tc>
@@ -161,7 +167,7 @@
             </w:pPr>
             <w:r>
               <w:rPr/>
-              <w:t>serveur 1 : Deno Oak / JWT</w:t>
+              <w:t xml:space="preserve">serveur 1 : </w:t>
             </w:r>
           </w:p>
         </w:tc>
@@ -176,11 +182,14 @@
           </w:tcPr>
           <w:p>
             <w:pPr>
-              <w:pStyle w:val="Contenudetableauuser"/>
-              <w:rPr/>
-            </w:pPr>
-            <w:r>
-              <w:rPr/>
+              <w:pStyle w:val="Normal"/>
+              <w:bidi w:val="0"/>
+              <w:jc w:val="start"/>
+              <w:rPr/>
+            </w:pPr>
+            <w:r>
+              <w:rPr/>
+              <w:t>Deno Oak / JWT</w:t>
             </w:r>
           </w:p>
         </w:tc>
@@ -204,7 +213,7 @@
             </w:pPr>
             <w:r>
               <w:rPr/>
-              <w:t>serveur 2 : Tomcat Spring</w:t>
+              <w:t xml:space="preserve">serveur 2 : </w:t>
             </w:r>
           </w:p>
         </w:tc>
@@ -219,11 +228,62 @@
           </w:tcPr>
           <w:p>
             <w:pPr>
-              <w:pStyle w:val="Contenudetableauuser"/>
-              <w:rPr/>
-            </w:pPr>
-            <w:r>
-              <w:rPr/>
+              <w:pStyle w:val="Normal"/>
+              <w:bidi w:val="0"/>
+              <w:jc w:val="start"/>
+              <w:rPr/>
+            </w:pPr>
+            <w:r>
+              <w:rPr/>
+              <w:t>Tomcat Spring</w:t>
+            </w:r>
+          </w:p>
+        </w:tc>
+      </w:tr>
+      <w:tr>
+        <w:trPr>
+          <w:trHeight w:val="401" w:hRule="atLeast"/>
+        </w:trPr>
+        <w:tc>
+          <w:tcPr>
+            <w:tcW w:w="4818" w:type="dxa"/>
+            <w:tcBorders>
+              <w:start w:val="single" w:sz="4" w:space="0" w:color="000000"/>
+              <w:bottom w:val="single" w:sz="4" w:space="0" w:color="000000"/>
+            </w:tcBorders>
+          </w:tcPr>
+          <w:p>
+            <w:pPr>
+              <w:pStyle w:val="Normal"/>
+              <w:bidi w:val="0"/>
+              <w:jc w:val="start"/>
+              <w:rPr/>
+            </w:pPr>
+            <w:r>
+              <w:rPr/>
+              <w:t>Base de données SQL :</w:t>
+            </w:r>
+          </w:p>
+        </w:tc>
+        <w:tc>
+          <w:tcPr>
+            <w:tcW w:w="4820" w:type="dxa"/>
+            <w:tcBorders>
+              <w:start w:val="single" w:sz="4" w:space="0" w:color="000000"/>
+              <w:bottom w:val="single" w:sz="4" w:space="0" w:color="000000"/>
+              <w:end w:val="single" w:sz="4" w:space="0" w:color="000000"/>
+            </w:tcBorders>
+          </w:tcPr>
+          <w:p>
+            <w:pPr>
+              <w:pStyle w:val="Normal"/>
+              <w:bidi w:val="0"/>
+              <w:jc w:val="start"/>
+              <w:rPr/>
+            </w:pPr>
+            <w:r>
+              <w:rPr/>
+              <w:t>SQLite</w:t>
             </w:r>
           </w:p>
         </w:tc>
@@ -247,7 +307,11 @@
             </w:pPr>
             <w:r>
               <w:rPr/>
-              <w:t>SQL SQLite</w:t>
+              <w:t>B</w:t>
+            </w:r>
+            <w:r>
+              <w:rPr/>
+              <w:t>ase de données noSQL :</w:t>
             </w:r>
           </w:p>
         </w:tc>
@@ -262,27 +326,6 @@
           </w:tcPr>
           <w:p>
             <w:pPr>
-              <w:pStyle w:val="Contenudetableauuser"/>
-              <w:rPr/>
-            </w:pPr>
-            <w:r>
-              <w:rPr/>
-            </w:r>
-          </w:p>
-        </w:tc>
-      </w:tr>
-      <w:tr>
-        <w:trPr/>
-        <w:tc>
-          <w:tcPr>
-            <w:tcW w:w="4818" w:type="dxa"/>
-            <w:tcBorders>
-              <w:start w:val="single" w:sz="4" w:space="0" w:color="000000"/>
-              <w:bottom w:val="single" w:sz="4" w:space="0" w:color="000000"/>
-            </w:tcBorders>
-          </w:tcPr>
-          <w:p>
-            <w:pPr>
               <w:pStyle w:val="Normal"/>
               <w:bidi w:val="0"/>
               <w:jc w:val="start"/>
@@ -291,25 +334,6 @@
             <w:r>
               <w:rPr/>
               <w:t>MongoDB</w:t>
-            </w:r>
-          </w:p>
-        </w:tc>
-        <w:tc>
-          <w:tcPr>
-            <w:tcW w:w="4820" w:type="dxa"/>
-            <w:tcBorders>
-              <w:start w:val="single" w:sz="4" w:space="0" w:color="000000"/>
-              <w:bottom w:val="single" w:sz="4" w:space="0" w:color="000000"/>
-              <w:end w:val="single" w:sz="4" w:space="0" w:color="000000"/>
-            </w:tcBorders>
-          </w:tcPr>
-          <w:p>
-            <w:pPr>
-              <w:pStyle w:val="Contenudetableauuser"/>
-              <w:rPr/>
-            </w:pPr>
-            <w:r>
-              <w:rPr/>
             </w:r>
           </w:p>
         </w:tc>
@@ -375,79 +399,59 @@
       <w:r>
         <w:rPr/>
         <w:tab/>
-        <w:t xml:space="preserve">— Création de compte utilisateur </w:t>
-      </w:r>
-      <w:r>
-        <w:rPr/>
-        <w:t>OK</w:t>
-      </w:r>
-    </w:p>
-    <w:p>
-      <w:pPr>
-        <w:pStyle w:val="Normal"/>
-        <w:bidi w:val="0"/>
-        <w:jc w:val="start"/>
-        <w:rPr/>
-      </w:pPr>
-      <w:r>
-        <w:rPr/>
-        <w:tab/>
-        <w:t xml:space="preserve">— Authentification </w:t>
-      </w:r>
-      <w:r>
-        <w:rPr/>
-        <w:t>OK</w:t>
-      </w:r>
-    </w:p>
-    <w:p>
-      <w:pPr>
-        <w:pStyle w:val="Normal"/>
-        <w:bidi w:val="0"/>
-        <w:jc w:val="start"/>
-        <w:rPr/>
-      </w:pPr>
-      <w:r>
-        <w:rPr/>
-        <w:tab/>
-        <w:t xml:space="preserve">— Consultation des tableaux auxquels l’utilisateur participe </w:t>
-      </w:r>
-      <w:r>
-        <w:rPr/>
-        <w:t>KO</w:t>
-      </w:r>
-    </w:p>
-    <w:p>
-      <w:pPr>
-        <w:pStyle w:val="Normal"/>
-        <w:bidi w:val="0"/>
-        <w:jc w:val="start"/>
-        <w:rPr/>
-      </w:pPr>
-      <w:r>
-        <w:rPr/>
-        <w:tab/>
-        <w:t xml:space="preserve">— Création d’un tableau </w:t>
-      </w:r>
-      <w:r>
-        <w:rPr/>
-        <w:t>OK</w:t>
-      </w:r>
-    </w:p>
-    <w:p>
-      <w:pPr>
-        <w:pStyle w:val="Normal"/>
-        <w:bidi w:val="0"/>
-        <w:jc w:val="start"/>
-        <w:rPr/>
-      </w:pPr>
-      <w:r>
-        <w:rPr/>
-        <w:tab/>
-        <w:t xml:space="preserve">— Invitation d’utilisateurs à un tableau </w:t>
-      </w:r>
-      <w:r>
-        <w:rPr/>
-        <w:t>KO</w:t>
+        <w:t>— Création de compte utilisateur OK</w:t>
+      </w:r>
+    </w:p>
+    <w:p>
+      <w:pPr>
+        <w:pStyle w:val="Normal"/>
+        <w:bidi w:val="0"/>
+        <w:jc w:val="start"/>
+        <w:rPr/>
+      </w:pPr>
+      <w:r>
+        <w:rPr/>
+        <w:tab/>
+        <w:t>— Authentification OK</w:t>
+      </w:r>
+    </w:p>
+    <w:p>
+      <w:pPr>
+        <w:pStyle w:val="Normal"/>
+        <w:bidi w:val="0"/>
+        <w:jc w:val="start"/>
+        <w:rPr/>
+      </w:pPr>
+      <w:r>
+        <w:rPr/>
+        <w:tab/>
+        <w:t>— Consultation des tableaux auxquels l’utilisateur participe KO</w:t>
+      </w:r>
+    </w:p>
+    <w:p>
+      <w:pPr>
+        <w:pStyle w:val="Normal"/>
+        <w:bidi w:val="0"/>
+        <w:jc w:val="start"/>
+        <w:rPr/>
+      </w:pPr>
+      <w:r>
+        <w:rPr/>
+        <w:tab/>
+        <w:t>— Création d’un tableau OK</w:t>
+      </w:r>
+    </w:p>
+    <w:p>
+      <w:pPr>
+        <w:pStyle w:val="Normal"/>
+        <w:bidi w:val="0"/>
+        <w:jc w:val="start"/>
+        <w:rPr/>
+      </w:pPr>
+      <w:r>
+        <w:rPr/>
+        <w:tab/>
+        <w:t>— Invitation d’utilisateurs à un tableau KO</w:t>
       </w:r>
     </w:p>
     <w:p>
@@ -474,137 +478,105 @@
         <w:rPr/>
         <w:tab/>
         <w:tab/>
-        <w:t xml:space="preserve">— Création, modification et suppression de tableaux </w:t>
-      </w:r>
-      <w:r>
-        <w:rPr/>
-        <w:t>OK</w:t>
-      </w:r>
-    </w:p>
-    <w:p>
-      <w:pPr>
-        <w:pStyle w:val="Normal"/>
-        <w:bidi w:val="0"/>
-        <w:jc w:val="start"/>
-        <w:rPr/>
-      </w:pPr>
-      <w:r>
-        <w:rPr/>
-        <w:tab/>
-        <w:tab/>
-        <w:t xml:space="preserve">— Gestion des membres d’un tableau </w:t>
-      </w:r>
-      <w:r>
-        <w:rPr/>
-        <w:t>KO</w:t>
-      </w:r>
-    </w:p>
-    <w:p>
-      <w:pPr>
-        <w:pStyle w:val="Normal"/>
-        <w:bidi w:val="0"/>
-        <w:jc w:val="start"/>
-        <w:rPr/>
-      </w:pPr>
-      <w:r>
-        <w:rPr/>
-        <w:tab/>
-        <w:tab/>
-        <w:t xml:space="preserve">— Création et suppression de colonnes </w:t>
-      </w:r>
-      <w:r>
-        <w:rPr/>
-        <w:t>OK (côté back)</w:t>
-      </w:r>
-    </w:p>
-    <w:p>
-      <w:pPr>
-        <w:pStyle w:val="Normal"/>
-        <w:bidi w:val="0"/>
-        <w:jc w:val="start"/>
-        <w:rPr/>
-      </w:pPr>
-      <w:r>
-        <w:rPr/>
-        <w:tab/>
-        <w:tab/>
-        <w:t xml:space="preserve">— Gestion des tâches </w:t>
-      </w:r>
-      <w:r>
-        <w:rPr/>
-        <w:t>OK</w:t>
-      </w:r>
-    </w:p>
-    <w:p>
-      <w:pPr>
-        <w:pStyle w:val="Normal"/>
-        <w:bidi w:val="0"/>
-        <w:jc w:val="start"/>
-        <w:rPr/>
-      </w:pPr>
-      <w:r>
-        <w:rPr/>
-        <w:tab/>
-        <w:tab/>
-        <w:t xml:space="preserve">— Création, modification et suppression de tâches </w:t>
-      </w:r>
-      <w:r>
-        <w:rPr/>
-        <w:t>OK</w:t>
-      </w:r>
-    </w:p>
-    <w:p>
-      <w:pPr>
-        <w:pStyle w:val="Normal"/>
-        <w:bidi w:val="0"/>
-        <w:jc w:val="start"/>
-        <w:rPr/>
-      </w:pPr>
-      <w:r>
-        <w:rPr/>
-        <w:tab/>
-        <w:tab/>
-        <w:t xml:space="preserve">— Attribution d’une tâche à un utilisateur </w:t>
-      </w:r>
-      <w:r>
-        <w:rPr/>
-        <w:t>KO</w:t>
-      </w:r>
-    </w:p>
-    <w:p>
-      <w:pPr>
-        <w:pStyle w:val="Normal"/>
-        <w:bidi w:val="0"/>
-        <w:jc w:val="start"/>
-        <w:rPr/>
-      </w:pPr>
-      <w:r>
-        <w:rPr/>
-        <w:tab/>
-        <w:tab/>
-        <w:t xml:space="preserve">— Ajout d’une date limite et d’une priorité </w:t>
-      </w:r>
-      <w:r>
-        <w:rPr/>
-        <w:t xml:space="preserve">OK </w:t>
-      </w:r>
-    </w:p>
-    <w:p>
-      <w:pPr>
-        <w:pStyle w:val="Normal"/>
-        <w:bidi w:val="0"/>
-        <w:jc w:val="start"/>
-        <w:rPr/>
-      </w:pPr>
-      <w:r>
-        <w:rPr/>
-        <w:tab/>
-        <w:tab/>
-        <w:t xml:space="preserve">— Ajout de commentaires </w:t>
-      </w:r>
-      <w:r>
-        <w:rPr/>
-        <w:t>OK</w:t>
+        <w:t>— Création, modification et suppression de tableaux OK</w:t>
+      </w:r>
+    </w:p>
+    <w:p>
+      <w:pPr>
+        <w:pStyle w:val="Normal"/>
+        <w:bidi w:val="0"/>
+        <w:jc w:val="start"/>
+        <w:rPr/>
+      </w:pPr>
+      <w:r>
+        <w:rPr/>
+        <w:tab/>
+        <w:tab/>
+        <w:t>— Gestion des membres d’un tableau KO</w:t>
+      </w:r>
+    </w:p>
+    <w:p>
+      <w:pPr>
+        <w:pStyle w:val="Normal"/>
+        <w:bidi w:val="0"/>
+        <w:jc w:val="start"/>
+        <w:rPr/>
+      </w:pPr>
+      <w:r>
+        <w:rPr/>
+        <w:tab/>
+        <w:tab/>
+        <w:t>— Création et suppression de colonnes OK (côté back)</w:t>
+      </w:r>
+    </w:p>
+    <w:p>
+      <w:pPr>
+        <w:pStyle w:val="Normal"/>
+        <w:bidi w:val="0"/>
+        <w:jc w:val="start"/>
+        <w:rPr/>
+      </w:pPr>
+      <w:r>
+        <w:rPr/>
+        <w:tab/>
+        <w:tab/>
+        <w:t>— Gestion des tâches OK</w:t>
+      </w:r>
+    </w:p>
+    <w:p>
+      <w:pPr>
+        <w:pStyle w:val="Normal"/>
+        <w:bidi w:val="0"/>
+        <w:jc w:val="start"/>
+        <w:rPr/>
+      </w:pPr>
+      <w:r>
+        <w:rPr/>
+        <w:tab/>
+        <w:tab/>
+        <w:t>— Création, modification et suppression de tâches OK</w:t>
+      </w:r>
+    </w:p>
+    <w:p>
+      <w:pPr>
+        <w:pStyle w:val="Normal"/>
+        <w:bidi w:val="0"/>
+        <w:jc w:val="start"/>
+        <w:rPr/>
+      </w:pPr>
+      <w:r>
+        <w:rPr/>
+        <w:tab/>
+        <w:tab/>
+        <w:t>— Attribution d’une tâche à un utilisateur KO</w:t>
+      </w:r>
+    </w:p>
+    <w:p>
+      <w:pPr>
+        <w:pStyle w:val="Normal"/>
+        <w:bidi w:val="0"/>
+        <w:jc w:val="start"/>
+        <w:rPr/>
+      </w:pPr>
+      <w:r>
+        <w:rPr/>
+        <w:tab/>
+        <w:tab/>
+        <w:t xml:space="preserve">— Ajout d’une date limite et d’une priorité OK </w:t>
+      </w:r>
+    </w:p>
+    <w:p>
+      <w:pPr>
+        <w:pStyle w:val="Normal"/>
+        <w:bidi w:val="0"/>
+        <w:jc w:val="start"/>
+        <w:rPr/>
+      </w:pPr>
+      <w:r>
+        <w:rPr/>
+        <w:tab/>
+        <w:tab/>
+        <w:t>— Ajout de commentaires OK</w:t>
       </w:r>
     </w:p>
     <w:p>
@@ -633,11 +605,7 @@
       <w:r>
         <w:rPr/>
         <w:tab/>
-        <w:t xml:space="preserve">— Gestion des comptes utilisateurs </w:t>
-      </w:r>
-      <w:r>
-        <w:rPr/>
-        <w:t>OK</w:t>
+        <w:t>— Gestion des comptes utilisateurs OK</w:t>
       </w:r>
     </w:p>
     <w:p>
@@ -664,47 +632,35 @@
         <w:rPr/>
         <w:tab/>
         <w:tab/>
-        <w:t xml:space="preserve">— nombre de tableaux </w:t>
-      </w:r>
-      <w:r>
-        <w:rPr/>
-        <w:t xml:space="preserve">OK </w:t>
-      </w:r>
-    </w:p>
-    <w:p>
-      <w:pPr>
-        <w:pStyle w:val="Normal"/>
-        <w:bidi w:val="0"/>
-        <w:jc w:val="start"/>
-        <w:rPr/>
-      </w:pPr>
-      <w:r>
-        <w:rPr/>
-        <w:tab/>
-        <w:tab/>
-        <w:t xml:space="preserve">— nombre de tâches </w:t>
-      </w:r>
-      <w:r>
-        <w:rPr/>
-        <w:t>OK</w:t>
-      </w:r>
-    </w:p>
-    <w:p>
-      <w:pPr>
-        <w:pStyle w:val="Normal"/>
-        <w:bidi w:val="0"/>
-        <w:jc w:val="start"/>
-        <w:rPr/>
-      </w:pPr>
-      <w:r>
-        <w:rPr/>
-        <w:tab/>
-        <w:tab/>
-        <w:t xml:space="preserve">— activité des utilisateurs </w:t>
-      </w:r>
-      <w:r>
-        <w:rPr/>
-        <w:t>KO</w:t>
+        <w:t xml:space="preserve">— nombre de tableaux OK </w:t>
+      </w:r>
+    </w:p>
+    <w:p>
+      <w:pPr>
+        <w:pStyle w:val="Normal"/>
+        <w:bidi w:val="0"/>
+        <w:jc w:val="start"/>
+        <w:rPr/>
+      </w:pPr>
+      <w:r>
+        <w:rPr/>
+        <w:tab/>
+        <w:tab/>
+        <w:t>— nombre de tâches OK</w:t>
+      </w:r>
+    </w:p>
+    <w:p>
+      <w:pPr>
+        <w:pStyle w:val="Normal"/>
+        <w:bidi w:val="0"/>
+        <w:jc w:val="start"/>
+        <w:rPr/>
+      </w:pPr>
+      <w:r>
+        <w:rPr/>
+        <w:tab/>
+        <w:tab/>
+        <w:t>— activité des utilisateurs KO</w:t>
       </w:r>
     </w:p>
     <w:p>
@@ -747,47 +703,35 @@
         <w:rPr/>
         <w:tab/>
         <w:tab/>
-        <w:t xml:space="preserve">— Réorganisation des colonnes </w:t>
-      </w:r>
-      <w:r>
-        <w:rPr/>
-        <w:t>KO</w:t>
-      </w:r>
-    </w:p>
-    <w:p>
-      <w:pPr>
-        <w:pStyle w:val="Normal"/>
-        <w:bidi w:val="0"/>
-        <w:jc w:val="start"/>
-        <w:rPr/>
-      </w:pPr>
-      <w:r>
-        <w:rPr/>
-        <w:tab/>
-        <w:tab/>
-        <w:t xml:space="preserve">— Déplacement de tâches entre colonnes (drag &amp; drop) </w:t>
-      </w:r>
-      <w:r>
-        <w:rPr/>
-        <w:t>OK</w:t>
-      </w:r>
-    </w:p>
-    <w:p>
-      <w:pPr>
-        <w:pStyle w:val="Normal"/>
-        <w:bidi w:val="0"/>
-        <w:jc w:val="start"/>
-        <w:rPr/>
-      </w:pPr>
-      <w:r>
-        <w:rPr/>
-        <w:tab/>
-        <w:tab/>
-        <w:t xml:space="preserve">— Ajout de pièces jointes </w:t>
-      </w:r>
-      <w:r>
-        <w:rPr/>
-        <w:t>KO</w:t>
+        <w:t>— Réorganisation des colonnes KO</w:t>
+      </w:r>
+    </w:p>
+    <w:p>
+      <w:pPr>
+        <w:pStyle w:val="Normal"/>
+        <w:bidi w:val="0"/>
+        <w:jc w:val="start"/>
+        <w:rPr/>
+      </w:pPr>
+      <w:r>
+        <w:rPr/>
+        <w:tab/>
+        <w:tab/>
+        <w:t>— Déplacement de tâches entre colonnes (drag &amp; drop) OK</w:t>
+      </w:r>
+    </w:p>
+    <w:p>
+      <w:pPr>
+        <w:pStyle w:val="Normal"/>
+        <w:bidi w:val="0"/>
+        <w:jc w:val="start"/>
+        <w:rPr/>
+      </w:pPr>
+      <w:r>
+        <w:rPr/>
+        <w:tab/>
+        <w:tab/>
+        <w:t>— Ajout de pièces jointes KO</w:t>
       </w:r>
     </w:p>
     <w:p>
@@ -814,29 +758,21 @@
         <w:rPr/>
         <w:tab/>
         <w:tab/>
-        <w:t xml:space="preserve">— Mise à jour instantanée des tableaux avec WebSockets (par exemple lorsqu’une tâche est déplacée) </w:t>
-      </w:r>
-      <w:r>
-        <w:rPr/>
-        <w:t>KO</w:t>
-      </w:r>
-    </w:p>
-    <w:p>
-      <w:pPr>
-        <w:pStyle w:val="Normal"/>
-        <w:bidi w:val="0"/>
-        <w:jc w:val="start"/>
-        <w:rPr/>
-      </w:pPr>
-      <w:r>
-        <w:rPr/>
-        <w:tab/>
-        <w:tab/>
-        <w:t xml:space="preserve">— Notification lorsqu’une tâche est assignée ou commentée </w:t>
-      </w:r>
-      <w:r>
-        <w:rPr/>
-        <w:t>KO</w:t>
+        <w:t>— Mise à jour instantanée des tableaux avec WebSockets (par exemple lorsqu’une tâche est déplacée) KO</w:t>
+      </w:r>
+    </w:p>
+    <w:p>
+      <w:pPr>
+        <w:pStyle w:val="Normal"/>
+        <w:bidi w:val="0"/>
+        <w:jc w:val="start"/>
+        <w:rPr/>
+      </w:pPr>
+      <w:r>
+        <w:rPr/>
+        <w:tab/>
+        <w:tab/>
+        <w:t>— Notification lorsqu’une tâche est assignée ou commentée KO</w:t>
       </w:r>
     </w:p>
     <w:p>
@@ -863,11 +799,7 @@
         <w:rPr/>
         <w:tab/>
         <w:tab/>
-        <w:t xml:space="preserve">— Journal des actions (création, déplacement et modification des tâches) </w:t>
-      </w:r>
-      <w:r>
-        <w:rPr/>
-        <w:t>OK</w:t>
+        <w:t>— Journal des actions (création, déplacement et modification des tâches) OK</w:t>
       </w:r>
     </w:p>
     <w:p>
@@ -894,11 +826,7 @@
         <w:rPr/>
         <w:tab/>
         <w:tab/>
-        <w:t xml:space="preserve">— Recherche de tâches par mot-clé, utilisateur ou priorité </w:t>
-      </w:r>
-      <w:r>
-        <w:rPr/>
-        <w:t>OK (sauf pour taches)</w:t>
+        <w:t>— Recherche de tâches par mot-clé, utilisateur ou priorité OK (sauf pour taches)</w:t>
       </w:r>
     </w:p>
     <w:sectPr>
@@ -1024,8 +952,8 @@
       <w:szCs w:val="28"/>
     </w:rPr>
   </w:style>
-  <w:style w:type="paragraph" w:styleId="Contenudetableauuser">
-    <w:name w:val="Contenu de tableau (user)"/>
+  <w:style w:type="paragraph" w:styleId="Contenudetableau">
+    <w:name w:val="Contenu de tableau"/>
     <w:basedOn w:val="Normal"/>
     <w:qFormat/>
     <w:pPr>

</xml_diff>